<commit_message>
Refresh PDF from updated Word file
</commit_message>
<xml_diff>
--- a/Alkhansae_CV 2026.docx
+++ b/Alkhansae_CV 2026.docx
@@ -143,7 +143,7 @@
           </mc:Choice>
           <mc:Fallback>
             <w:pict>
-              <v:group w14:anchorId="09D40870" id="Group 1" o:spid="_x0000_s1026" style="position:absolute;margin-left:464.25pt;margin-top:12.4pt;width:104.55pt;height:115.15pt;z-index:251658240;mso-wrap-distance-left:0;mso-wrap-distance-right:0;mso-position-horizontal-relative:page" coordsize="13277,14624" o:gfxdata="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">
+              <v:group w14:anchorId="3B32CEA5" id="Group 1" o:spid="_x0000_s1026" style="position:absolute;margin-left:464.25pt;margin-top:12.4pt;width:104.55pt;height:115.15pt;z-index:251658240;mso-wrap-distance-left:0;mso-wrap-distance-right:0;mso-position-horizontal-relative:page" coordsize="13277,14624" o:gfxdata="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">
                 <v:shapetype id="_x0000_t75" coordsize="21600,21600" o:spt="75" o:preferrelative="t" path="m@4@5l@4@11@9@11@9@5xe" filled="f" stroked="f">
                   <v:stroke joinstyle="miter"/>
                   <v:formulas>
@@ -322,8 +322,13 @@
         </w:rPr>
         <w:t xml:space="preserve"> </w:t>
       </w:r>
-      <w:r>
-        <w:t>essalam,</w:t>
+      <w:proofErr w:type="spellStart"/>
+      <w:r>
+        <w:t>essalam</w:t>
+      </w:r>
+      <w:proofErr w:type="spellEnd"/>
+      <w:r>
+        <w:t>,</w:t>
       </w:r>
       <w:r>
         <w:rPr>
@@ -991,7 +996,7 @@
           </mc:Choice>
           <mc:Fallback>
             <w:pict>
-              <v:group w14:anchorId="20D2A848" id="Group 6" o:spid="_x0000_s1026" style="position:absolute;margin-left:27.7pt;margin-top:-35.5pt;width:548.1pt;height:676.15pt;z-index:-15796736;mso-wrap-distance-left:0;mso-wrap-distance-right:0;mso-position-horizontal-relative:page" coordsize="69608,85871" o:gfxdata="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">
+              <v:group w14:anchorId="3B08CC2F" id="Group 6" o:spid="_x0000_s1026" style="position:absolute;margin-left:27.7pt;margin-top:-35.5pt;width:548.1pt;height:676.15pt;z-index:-15796736;mso-wrap-distance-left:0;mso-wrap-distance-right:0;mso-position-horizontal-relative:page" coordsize="69608,85871" o:gfxdata="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">
                 <v:shape id="Graphic 7" o:spid="_x0000_s1027" style="position:absolute;left:93;top:1547;width:69514;height:84322;visibility:visible;mso-wrap-style:square;v-text-anchor:top" coordsize="6951345,8432165" o:gfxdata="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" path="m4318,l3048,r,12192l4318,12192,4318,xem27432,216420r-12192,l3048,216420r,12180l15240,228600r12192,l27432,216420xem6944868,8419846l,8419846r,12192l6944868,8432038r,-12192xem6950964,216420r-12192,l6938772,228600r12192,l6950964,216420xem6950964,r-12192,l6938772,12192r12192,l6950964,xe" fillcolor="#49acc5" stroked="f">
                   <v:path arrowok="t"/>
                 </v:shape>
@@ -1012,7 +1017,14 @@
           <w:b/>
           <w:color w:val="365F91"/>
         </w:rPr>
-        <w:t>2025</w:t>
+        <w:t>202</w:t>
+      </w:r>
+      <w:r>
+        <w:rPr>
+          <w:b/>
+          <w:color w:val="365F91"/>
+        </w:rPr>
+        <w:t>4</w:t>
       </w:r>
       <w:r>
         <w:rPr>
@@ -1789,9 +1801,11 @@
               </w:rPr>
               <w:t xml:space="preserve"> </w:t>
             </w:r>
+            <w:proofErr w:type="spellStart"/>
             <w:r>
               <w:t>Zitoune</w:t>
             </w:r>
+            <w:proofErr w:type="spellEnd"/>
             <w:r>
               <w:rPr>
                 <w:spacing w:val="-4"/>
@@ -2011,7 +2025,31 @@
               <w:t xml:space="preserve"> </w:t>
             </w:r>
             <w:r>
-              <w:t>(El Hajeb, Ouisslane, Boufekrane).</w:t>
+              <w:t xml:space="preserve">(El </w:t>
+            </w:r>
+            <w:proofErr w:type="spellStart"/>
+            <w:r>
+              <w:t>Hajeb</w:t>
+            </w:r>
+            <w:proofErr w:type="spellEnd"/>
+            <w:r>
+              <w:t xml:space="preserve">, </w:t>
+            </w:r>
+            <w:proofErr w:type="spellStart"/>
+            <w:r>
+              <w:t>Ouisslane</w:t>
+            </w:r>
+            <w:proofErr w:type="spellEnd"/>
+            <w:r>
+              <w:t xml:space="preserve">, </w:t>
+            </w:r>
+            <w:proofErr w:type="spellStart"/>
+            <w:r>
+              <w:t>Boufekrane</w:t>
+            </w:r>
+            <w:proofErr w:type="spellEnd"/>
+            <w:r>
+              <w:t>).</w:t>
             </w:r>
           </w:p>
           <w:p>
@@ -2166,8 +2204,13 @@
               <w:t xml:space="preserve"> </w:t>
             </w:r>
             <w:r>
-              <w:t>à Laayayda</w:t>
-            </w:r>
+              <w:t xml:space="preserve">à </w:t>
+            </w:r>
+            <w:proofErr w:type="spellStart"/>
+            <w:r>
+              <w:t>Laayayda</w:t>
+            </w:r>
+            <w:proofErr w:type="spellEnd"/>
             <w:r>
               <w:rPr>
                 <w:spacing w:val="-1"/>
@@ -2184,8 +2227,8 @@
           <w:p>
             <w:pPr>
               <w:pStyle w:val="TableParagraph"/>
-              <w:spacing w:before="222" w:line="451" w:lineRule="auto"/>
-              <w:ind w:left="2697" w:right="1211" w:hanging="2586"/>
+              <w:spacing w:line="276" w:lineRule="auto"/>
+              <w:ind w:left="2697" w:right="170" w:hanging="2586"/>
               <w:jc w:val="both"/>
             </w:pPr>
             <w:r>
@@ -2256,6 +2299,13 @@
               <w:t xml:space="preserve">: </w:t>
             </w:r>
             <w:r>
+              <w:rPr>
+                <w:b/>
+                <w:color w:val="365F91"/>
+              </w:rPr>
+              <w:t>-</w:t>
+            </w:r>
+            <w:r>
               <w:t>Médecin remplaçante à</w:t>
             </w:r>
             <w:r>
@@ -2300,8 +2350,27 @@
               </w:rPr>
               <w:t xml:space="preserve"> </w:t>
             </w:r>
-            <w:r>
-              <w:t>Tabriket ; El Karia). Médecin</w:t>
+            <w:proofErr w:type="spellStart"/>
+            <w:r>
+              <w:t>Tabriket</w:t>
+            </w:r>
+            <w:proofErr w:type="spellEnd"/>
+            <w:r>
+              <w:t xml:space="preserve"> ; El Karia).</w:t>
+            </w:r>
+          </w:p>
+          <w:p>
+            <w:pPr>
+              <w:pStyle w:val="TableParagraph"/>
+              <w:spacing w:line="276" w:lineRule="auto"/>
+              <w:ind w:left="2697" w:right="595" w:hanging="27"/>
+              <w:jc w:val="both"/>
+            </w:pPr>
+            <w:r>
+              <w:t>-</w:t>
+            </w:r>
+            <w:r>
+              <w:t>Médecin</w:t>
             </w:r>
             <w:r>
               <w:rPr>
@@ -2382,16 +2451,27 @@
               <w:t xml:space="preserve"> </w:t>
             </w:r>
             <w:r>
-              <w:t>d’urgences) Concours de résidanat spécialité Médicale</w:t>
+              <w:t xml:space="preserve">d’urgences) </w:t>
+            </w:r>
+          </w:p>
+          <w:p>
+            <w:pPr>
+              <w:pStyle w:val="TableParagraph"/>
+              <w:spacing w:line="276" w:lineRule="auto"/>
+              <w:ind w:left="2697" w:right="1211" w:hanging="27"/>
+              <w:jc w:val="both"/>
+            </w:pPr>
+            <w:r>
+              <w:t>-</w:t>
+            </w:r>
+            <w:r>
+              <w:t>Concours de résidanat spécialité Médicale</w:t>
             </w:r>
           </w:p>
           <w:p>
             <w:pPr>
               <w:pStyle w:val="TableParagraph"/>
               <w:jc w:val="both"/>
-              <w:rPr>
-                <w:b/>
-              </w:rPr>
             </w:pPr>
             <w:r>
               <w:rPr>
@@ -2461,13 +2541,14 @@
               </w:rPr>
               <w:t>Formateur</w:t>
             </w:r>
-          </w:p>
-          <w:p>
-            <w:pPr>
-              <w:pStyle w:val="TableParagraph"/>
-              <w:spacing w:before="4" w:line="276" w:lineRule="auto"/>
-              <w:ind w:left="883" w:right="1229"/>
-            </w:pPr>
+            <w:r>
+              <w:rPr>
+                <w:b/>
+                <w:color w:val="612221"/>
+                <w:spacing w:val="-2"/>
+              </w:rPr>
+              <w:t xml:space="preserve"> : </w:t>
+            </w:r>
             <w:r>
               <w:t>Programme</w:t>
             </w:r>
@@ -2606,16 +2687,9 @@
             <w:r>
               <w:t>entre le Ministère de l'Education, de l'Enseignement supérieur,</w:t>
             </w:r>
-          </w:p>
-          <w:p>
-            <w:pPr>
-              <w:pStyle w:val="TableParagraph"/>
-              <w:spacing w:before="2" w:line="276" w:lineRule="auto"/>
-              <w:ind w:left="883" w:right="1229"/>
-              <w:rPr>
-                <w:i/>
-              </w:rPr>
-            </w:pPr>
+            <w:r>
+              <w:t xml:space="preserve"> </w:t>
+            </w:r>
             <w:r>
               <w:t>de</w:t>
             </w:r>
@@ -3930,7 +4004,7 @@
           </mc:Choice>
           <mc:Fallback>
             <w:pict>
-              <v:group w14:anchorId="5B3F34AE" id="Group 10" o:spid="_x0000_s1026" style="width:546.15pt;height:1pt;mso-position-horizontal-relative:char;mso-position-vertical-relative:line" coordsize="69361,127" o:gfxdata="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">
+              <v:group w14:anchorId="28433699" id="Group 10" o:spid="_x0000_s1026" style="width:546.15pt;height:1pt;mso-position-horizontal-relative:char;mso-position-vertical-relative:line" coordsize="69361,127" o:gfxdata="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">
                 <v:shape id="Graphic 11" o:spid="_x0000_s1027" style="position:absolute;width:69361;height:127;visibility:visible;mso-wrap-style:square;v-text-anchor:top" coordsize="6936105,12700" o:gfxdata="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" path="m6935724,l,,,12192r6935724,l6935724,xe" fillcolor="#49acc5" stroked="f">
                   <v:path arrowok="t"/>
                 </v:shape>

</xml_diff>

<commit_message>
Refresh PDF from updated Word
</commit_message>
<xml_diff>
--- a/Alkhansae_CV 2026.docx
+++ b/Alkhansae_CV 2026.docx
@@ -143,7 +143,7 @@
           </mc:Choice>
           <mc:Fallback>
             <w:pict>
-              <v:group w14:anchorId="3B32CEA5" id="Group 1" o:spid="_x0000_s1026" style="position:absolute;margin-left:464.25pt;margin-top:12.4pt;width:104.55pt;height:115.15pt;z-index:251658240;mso-wrap-distance-left:0;mso-wrap-distance-right:0;mso-position-horizontal-relative:page" coordsize="13277,14624" o:gfxdata="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">
+              <v:group w14:anchorId="3CDB80B8" id="Group 1" o:spid="_x0000_s1026" style="position:absolute;margin-left:464.25pt;margin-top:12.4pt;width:104.55pt;height:115.15pt;z-index:251658240;mso-wrap-distance-left:0;mso-wrap-distance-right:0;mso-position-horizontal-relative:page" coordsize="13277,14624" o:gfxdata="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">
                 <v:shapetype id="_x0000_t75" coordsize="21600,21600" o:spt="75" o:preferrelative="t" path="m@4@5l@4@11@9@11@9@5xe" filled="f" stroked="f">
                   <v:stroke joinstyle="miter"/>
                   <v:formulas>
@@ -189,7 +189,7 @@
         <w:rPr>
           <w:color w:val="612221"/>
         </w:rPr>
-        <w:t>Mme</w:t>
+        <w:t xml:space="preserve">Dr </w:t>
       </w:r>
       <w:r>
         <w:rPr>
@@ -322,13 +322,8 @@
         </w:rPr>
         <w:t xml:space="preserve"> </w:t>
       </w:r>
-      <w:proofErr w:type="spellStart"/>
-      <w:r>
-        <w:t>essalam</w:t>
-      </w:r>
-      <w:proofErr w:type="spellEnd"/>
-      <w:r>
-        <w:t>,</w:t>
+      <w:r>
+        <w:t>essalam,</w:t>
       </w:r>
       <w:r>
         <w:rPr>
@@ -996,7 +991,7 @@
           </mc:Choice>
           <mc:Fallback>
             <w:pict>
-              <v:group w14:anchorId="3B08CC2F" id="Group 6" o:spid="_x0000_s1026" style="position:absolute;margin-left:27.7pt;margin-top:-35.5pt;width:548.1pt;height:676.15pt;z-index:-15796736;mso-wrap-distance-left:0;mso-wrap-distance-right:0;mso-position-horizontal-relative:page" coordsize="69608,85871" o:gfxdata="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">
+              <v:group w14:anchorId="6FB9B1CA" id="Group 6" o:spid="_x0000_s1026" style="position:absolute;margin-left:27.7pt;margin-top:-35.5pt;width:548.1pt;height:676.15pt;z-index:-15796736;mso-wrap-distance-left:0;mso-wrap-distance-right:0;mso-position-horizontal-relative:page" coordsize="69608,85871" o:gfxdata="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">
                 <v:shape id="Graphic 7" o:spid="_x0000_s1027" style="position:absolute;left:93;top:1547;width:69514;height:84322;visibility:visible;mso-wrap-style:square;v-text-anchor:top" coordsize="6951345,8432165" o:gfxdata="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" path="m4318,l3048,r,12192l4318,12192,4318,xem27432,216420r-12192,l3048,216420r,12180l15240,228600r12192,l27432,216420xem6944868,8419846l,8419846r,12192l6944868,8432038r,-12192xem6950964,216420r-12192,l6938772,228600r12192,l6950964,216420xem6950964,r-12192,l6938772,12192r12192,l6950964,xe" fillcolor="#49acc5" stroked="f">
                   <v:path arrowok="t"/>
                 </v:shape>
@@ -1057,7 +1052,7 @@
       <w:pPr>
         <w:pStyle w:val="BodyText"/>
         <w:spacing w:before="174" w:line="251" w:lineRule="exact"/>
-        <w:ind w:left="220"/>
+        <w:ind w:left="1418" w:hanging="1276"/>
       </w:pPr>
       <w:r>
         <w:rPr>
@@ -1256,15 +1251,15 @@
           <w:color w:val="402F52"/>
           <w:spacing w:val="-2"/>
         </w:rPr>
-        <w:t xml:space="preserve"> Rabat.</w:t>
-      </w:r>
-    </w:p>
-    <w:p>
-      <w:pPr>
-        <w:pStyle w:val="BodyText"/>
-        <w:spacing w:line="251" w:lineRule="exact"/>
-        <w:ind w:left="1354"/>
-      </w:pPr>
+        <w:t xml:space="preserve"> Rabat</w:t>
+      </w:r>
+      <w:r>
+        <w:rPr>
+          <w:color w:val="402F52"/>
+          <w:spacing w:val="-2"/>
+        </w:rPr>
+        <w:t xml:space="preserve"> </w:t>
+      </w:r>
       <w:r>
         <w:rPr>
           <w:b/>
@@ -1513,14 +1508,15 @@
           <w:color w:val="402F52"/>
           <w:spacing w:val="-2"/>
         </w:rPr>
-        <w:t>expérimentale.</w:t>
-      </w:r>
-    </w:p>
-    <w:p>
-      <w:pPr>
-        <w:spacing w:line="237" w:lineRule="exact"/>
-        <w:ind w:left="1354"/>
-      </w:pPr>
+        <w:t>expérimentale</w:t>
+      </w:r>
+      <w:r>
+        <w:rPr>
+          <w:color w:val="402F52"/>
+          <w:spacing w:val="-2"/>
+        </w:rPr>
+        <w:t xml:space="preserve"> </w:t>
+      </w:r>
       <w:r>
         <w:rPr>
           <w:b/>
@@ -1748,7 +1744,10 @@
               <w:t xml:space="preserve"> </w:t>
             </w:r>
             <w:r>
-              <w:t>du</w:t>
+              <w:t>d</w:t>
+            </w:r>
+            <w:r>
+              <w:t>e</w:t>
             </w:r>
             <w:r>
               <w:rPr>
@@ -1801,11 +1800,9 @@
               </w:rPr>
               <w:t xml:space="preserve"> </w:t>
             </w:r>
-            <w:proofErr w:type="spellStart"/>
             <w:r>
               <w:t>Zitoune</w:t>
             </w:r>
-            <w:proofErr w:type="spellEnd"/>
             <w:r>
               <w:rPr>
                 <w:spacing w:val="-4"/>
@@ -2025,31 +2022,7 @@
               <w:t xml:space="preserve"> </w:t>
             </w:r>
             <w:r>
-              <w:t xml:space="preserve">(El </w:t>
-            </w:r>
-            <w:proofErr w:type="spellStart"/>
-            <w:r>
-              <w:t>Hajeb</w:t>
-            </w:r>
-            <w:proofErr w:type="spellEnd"/>
-            <w:r>
-              <w:t xml:space="preserve">, </w:t>
-            </w:r>
-            <w:proofErr w:type="spellStart"/>
-            <w:r>
-              <w:t>Ouisslane</w:t>
-            </w:r>
-            <w:proofErr w:type="spellEnd"/>
-            <w:r>
-              <w:t xml:space="preserve">, </w:t>
-            </w:r>
-            <w:proofErr w:type="spellStart"/>
-            <w:r>
-              <w:t>Boufekrane</w:t>
-            </w:r>
-            <w:proofErr w:type="spellEnd"/>
-            <w:r>
-              <w:t>).</w:t>
+              <w:t>(El Hajeb, Ouisslane, Boufekrane).</w:t>
             </w:r>
           </w:p>
           <w:p>
@@ -2204,13 +2177,8 @@
               <w:t xml:space="preserve"> </w:t>
             </w:r>
             <w:r>
-              <w:t xml:space="preserve">à </w:t>
-            </w:r>
-            <w:proofErr w:type="spellStart"/>
-            <w:r>
-              <w:t>Laayayda</w:t>
-            </w:r>
-            <w:proofErr w:type="spellEnd"/>
+              <w:t>à Laayayda</w:t>
+            </w:r>
             <w:r>
               <w:rPr>
                 <w:spacing w:val="-1"/>
@@ -2228,7 +2196,7 @@
             <w:pPr>
               <w:pStyle w:val="TableParagraph"/>
               <w:spacing w:line="276" w:lineRule="auto"/>
-              <w:ind w:left="2697" w:right="170" w:hanging="2586"/>
+              <w:ind w:left="2697" w:right="453" w:hanging="2586"/>
               <w:jc w:val="both"/>
             </w:pPr>
             <w:r>
@@ -2306,7 +2274,10 @@
               <w:t>-</w:t>
             </w:r>
             <w:r>
-              <w:t>Médecin remplaçante à</w:t>
+              <w:t xml:space="preserve">Médecin remplaçante </w:t>
+            </w:r>
+            <w:r>
+              <w:t>dans</w:t>
             </w:r>
             <w:r>
               <w:rPr>
@@ -2350,22 +2321,18 @@
               </w:rPr>
               <w:t xml:space="preserve"> </w:t>
             </w:r>
-            <w:proofErr w:type="spellStart"/>
-            <w:r>
-              <w:t>Tabriket</w:t>
-            </w:r>
-            <w:proofErr w:type="spellEnd"/>
+            <w:r>
+              <w:t>Tabri</w:t>
+            </w:r>
+            <w:r>
+              <w:t>quet</w:t>
+            </w:r>
             <w:r>
               <w:t xml:space="preserve"> ; El Karia).</w:t>
             </w:r>
-          </w:p>
-          <w:p>
-            <w:pPr>
-              <w:pStyle w:val="TableParagraph"/>
-              <w:spacing w:line="276" w:lineRule="auto"/>
-              <w:ind w:left="2697" w:right="595" w:hanging="27"/>
-              <w:jc w:val="both"/>
-            </w:pPr>
+            <w:r>
+              <w:t xml:space="preserve">             </w:t>
+            </w:r>
             <w:r>
               <w:t>-</w:t>
             </w:r>
@@ -2451,21 +2418,31 @@
               <w:t xml:space="preserve"> </w:t>
             </w:r>
             <w:r>
-              <w:t xml:space="preserve">d’urgences) </w:t>
-            </w:r>
-          </w:p>
-          <w:p>
-            <w:pPr>
-              <w:pStyle w:val="TableParagraph"/>
-              <w:spacing w:line="276" w:lineRule="auto"/>
-              <w:ind w:left="2697" w:right="1211" w:hanging="27"/>
-              <w:jc w:val="both"/>
-            </w:pPr>
+              <w:t>d’urgences)</w:t>
+            </w:r>
+            <w:r>
+              <w:t>.</w:t>
+            </w:r>
+            <w:r>
+              <w:t xml:space="preserve"> </w:t>
+            </w:r>
+            <w:r>
+              <w:t xml:space="preserve">            </w:t>
+            </w:r>
             <w:r>
               <w:t>-</w:t>
             </w:r>
             <w:r>
-              <w:t>Concours de résidanat spécialité Médicale</w:t>
+              <w:t xml:space="preserve">Concours de résidanat </w:t>
+            </w:r>
+            <w:r>
+              <w:t>(</w:t>
+            </w:r>
+            <w:r>
+              <w:t>spécialité Médicale</w:t>
+            </w:r>
+            <w:r>
+              <w:t>).</w:t>
             </w:r>
           </w:p>
           <w:p>
@@ -4004,7 +3981,7 @@
           </mc:Choice>
           <mc:Fallback>
             <w:pict>
-              <v:group w14:anchorId="28433699" id="Group 10" o:spid="_x0000_s1026" style="width:546.15pt;height:1pt;mso-position-horizontal-relative:char;mso-position-vertical-relative:line" coordsize="69361,127" o:gfxdata="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">
+              <v:group w14:anchorId="515848F4" id="Group 10" o:spid="_x0000_s1026" style="width:546.15pt;height:1pt;mso-position-horizontal-relative:char;mso-position-vertical-relative:line" coordsize="69361,127" o:gfxdata="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">
                 <v:shape id="Graphic 11" o:spid="_x0000_s1027" style="position:absolute;width:69361;height:127;visibility:visible;mso-wrap-style:square;v-text-anchor:top" coordsize="6936105,12700" o:gfxdata="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" path="m6935724,l,,,12192r6935724,l6935724,xe" fillcolor="#49acc5" stroked="f">
                   <v:path arrowok="t"/>
                 </v:shape>

</xml_diff>